<commit_message>
docs: redefine Fix and Go as Capstone MVP
</commit_message>
<xml_diff>
--- a/APT122_005D/Equipo_Por_Definir/Fase_1/Evidencias_Individuales/Olmedo_Benjamin/Olmedo_Benjamin_1.2_APT122_DiarioReflexionFase1.docx
+++ b/APT122_005D/Equipo_Por_Definir/Fase_1/Evidencias_Individuales/Olmedo_Benjamin/Olmedo_Benjamin_1.2_APT122_DiarioReflexionFase1.docx
@@ -1311,7 +1311,7 @@
                 <w:color w:val="000000"/>
                 <w:sz w:val="21"/>
               </w:rPr>
-              <w:t>La propuesta trabajada anteriormente requiere un cambio, porque ya no representa de manera suficiente nuestras proyecciones profesionales actuales. El nuevo proyecto se llama Fix &amp; Go y se orienta al desarrollo de una aplicación móvil para conectar a personas que necesitan resolver un problema con profesionales cercanos capaces de prestar el servicio.</w:t>
+              <w:t>La propuesta vigente se llama Fix &amp; Go. Es una plataforma web y móvil para conectar a personas que necesitan resolver servicios técnicos del hogar con profesionales cercanos y verificables. La entrada del proyecto se concentra en gas, electricidad y agua; otras categorías quedan como expansión posterior a la validación.</w:t>
             </w:r>
           </w:p>
           <w:p>
@@ -1325,7 +1325,7 @@
                 <w:color w:val="000000"/>
                 <w:sz w:val="21"/>
               </w:rPr>
-              <w:t>El proyecto debe abordar desarrollo móvil, experiencia de usuario, análisis de requerimientos, modelos de datos, seguridad, pruebas y gestión de proyectos. Su contexto será el mercado de servicios locales, donde muchas contrataciones todavía dependen de recomendaciones informales, publicaciones dispersas y poca información sobre disponibilidad o confianza.</w:t>
+              <w:t>El producto completo considera perfiles diferenciados, validación de credenciales, búsqueda, solicitudes, cotizaciones, mensajería interna, pagos seguros, seguimiento y reputación. Para APT122 construiremos un MVP con datos ficticios e integraciones sensibles simuladas, de forma que podamos probar el recorrido sin procesar dinero, documentos o direcciones reales.</w:t>
             </w:r>
           </w:p>
           <w:p>
@@ -1339,7 +1339,7 @@
                 <w:color w:val="000000"/>
                 <w:sz w:val="21"/>
               </w:rPr>
-              <w:t>Fix &amp; Go puede aportar a mi desarrollo profesional porque combina mi interés por construir interfaces móviles con mi proyección como director y dueño de productos tecnológicos. Mi aporte inicial estará enfocado en frontend, prototipado y experiencia de usuario. La distribución definitiva de backend, datos y calidad será acordada entre Benjamín Olmedo, Daniel Baeza y Felipe Arce según las fortalezas de cada integrante.</w:t>
+              <w:t>Fix &amp; Go aporta a mi desarrollo profesional porque combina frontend móvil y web, experiencia de usuario, análisis, arquitectura, seguridad, pruebas y gestión. Mi aporte inicial se enfocará en frontend, prototipado y consistencia de la experiencia. La distribución definitiva de backend, datos y calidad se acordará con Daniel Baeza y Felipe Arce según las fortalezas de cada integrante.</w:t>
             </w:r>
           </w:p>
         </w:tc>

</xml_diff>